<commit_message>
feat: import bank soal excel, pengaturan ujian per kendaraan & timer, perbaikan registrasi instansi manual, dan dukungan upload dokumen pdf/png/jpg
</commit_message>
<xml_diff>
--- a/backend/uploads/templates/merah.docx
+++ b/backend/uploads/templates/merah.docx
@@ -17,16 +17,16 @@
           <w:noProof/>
         </w:rPr>
         <w:drawing>
-          <wp:anchor distT="0" distB="0" distL="114300" distR="114300" simplePos="0" relativeHeight="251658752" behindDoc="1" locked="0" layoutInCell="1" allowOverlap="1" wp14:anchorId="6054091E" wp14:editId="3ECE80D1">
+          <wp:anchor distT="0" distB="0" distL="114300" distR="114300" simplePos="0" relativeHeight="251658752" behindDoc="1" locked="0" layoutInCell="1" allowOverlap="1" wp14:anchorId="6054091E" wp14:editId="06348554">
             <wp:simplePos x="0" y="0"/>
             <wp:positionH relativeFrom="margin">
-              <wp:align>right</wp:align>
+              <wp:posOffset>-9098</wp:posOffset>
             </wp:positionH>
             <wp:positionV relativeFrom="paragraph">
-              <wp:posOffset>3732</wp:posOffset>
+              <wp:posOffset>4549</wp:posOffset>
             </wp:positionV>
-            <wp:extent cx="1955165" cy="3086567"/>
-            <wp:effectExtent l="0" t="0" r="6985" b="0"/>
+            <wp:extent cx="1963968" cy="3086100"/>
+            <wp:effectExtent l="0" t="0" r="0" b="0"/>
             <wp:wrapNone/>
             <wp:docPr id="91" name="Picture 4"/>
             <wp:cNvGraphicFramePr>
@@ -57,7 +57,7 @@
                   <pic:spPr bwMode="auto">
                     <a:xfrm>
                       <a:off x="0" y="0"/>
-                      <a:ext cx="1955165" cy="3086567"/>
+                      <a:ext cx="1973717" cy="3101419"/>
                     </a:xfrm>
                     <a:prstGeom prst="rect">
                       <a:avLst/>
@@ -136,6 +136,121 @@
                 <w:lang w:val="en-US"/>
               </w:rPr>
             </w:pPr>
+            <w:r>
+              <w:rPr>
+                <w:noProof/>
+              </w:rPr>
+              <mc:AlternateContent>
+                <mc:Choice Requires="wps">
+                  <w:drawing>
+                    <wp:anchor distT="0" distB="0" distL="114300" distR="114300" simplePos="0" relativeHeight="251660800" behindDoc="0" locked="0" layoutInCell="1" allowOverlap="1" wp14:anchorId="26796A42" wp14:editId="50017CDF">
+                      <wp:simplePos x="0" y="0"/>
+                      <wp:positionH relativeFrom="column">
+                        <wp:posOffset>-79375</wp:posOffset>
+                      </wp:positionH>
+                      <wp:positionV relativeFrom="paragraph">
+                        <wp:posOffset>153670</wp:posOffset>
+                      </wp:positionV>
+                      <wp:extent cx="489285" cy="469231"/>
+                      <wp:effectExtent l="0" t="0" r="0" b="7620"/>
+                      <wp:wrapNone/>
+                      <wp:docPr id="418808790" name="Text Box 5"/>
+                      <wp:cNvGraphicFramePr/>
+                      <a:graphic xmlns:a="http://schemas.openxmlformats.org/drawingml/2006/main">
+                        <a:graphicData uri="http://schemas.microsoft.com/office/word/2010/wordprocessingShape">
+                          <wps:wsp>
+                            <wps:cNvSpPr txBox="1"/>
+                            <wps:spPr>
+                              <a:xfrm>
+                                <a:off x="0" y="0"/>
+                                <a:ext cx="489285" cy="469231"/>
+                              </a:xfrm>
+                              <a:prstGeom prst="rect">
+                                <a:avLst/>
+                              </a:prstGeom>
+                              <a:noFill/>
+                              <a:ln>
+                                <a:noFill/>
+                              </a:ln>
+                            </wps:spPr>
+                            <wps:style>
+                              <a:lnRef idx="0">
+                                <a:scrgbClr r="0" g="0" b="0"/>
+                              </a:lnRef>
+                              <a:fillRef idx="0">
+                                <a:scrgbClr r="0" g="0" b="0"/>
+                              </a:fillRef>
+                              <a:effectRef idx="0">
+                                <a:scrgbClr r="0" g="0" b="0"/>
+                              </a:effectRef>
+                              <a:fontRef idx="minor">
+                                <a:schemeClr val="dk1"/>
+                              </a:fontRef>
+                            </wps:style>
+                            <wps:txbx>
+                              <w:txbxContent>
+                                <w:p>
+                                  <w:pPr>
+                                    <w:rPr>
+                                      <w:sz w:val="6"/>
+                                      <w:szCs w:val="6"/>
+                                      <w:lang w:val="en-US"/>
+                                    </w:rPr>
+                                  </w:pPr>
+                                  <w:r>
+                                    <w:rPr>
+                                      <w:sz w:val="6"/>
+                                      <w:szCs w:val="6"/>
+                                    </w:rPr>
+                                    <w:t>{%qr_code}</w:t>
+                                  </w:r>
+                                </w:p>
+                              </w:txbxContent>
+                            </wps:txbx>
+                            <wps:bodyPr rot="0" spcFirstLastPara="0" vertOverflow="overflow" horzOverflow="overflow" vert="horz" wrap="square" lIns="91440" tIns="45720" rIns="91440" bIns="45720" numCol="1" spcCol="0" rtlCol="0" fromWordArt="0" anchor="t" anchorCtr="0" forceAA="0" compatLnSpc="1">
+                              <a:prstTxWarp prst="textNoShape">
+                                <a:avLst/>
+                              </a:prstTxWarp>
+                              <a:noAutofit/>
+                            </wps:bodyPr>
+                          </wps:wsp>
+                        </a:graphicData>
+                      </a:graphic>
+                    </wp:anchor>
+                  </w:drawing>
+                </mc:Choice>
+                <mc:Fallback>
+                  <w:pict>
+                    <v:shapetype w14:anchorId="26796A42" id="_x0000_t202" coordsize="21600,21600" o:spt="202" path="m,l,21600r21600,l21600,xe">
+                      <v:stroke joinstyle="miter"/>
+                      <v:path gradientshapeok="t" o:connecttype="rect"/>
+                    </v:shapetype>
+                    <v:shape id="Text Box 5" o:spid="_x0000_s1026" type="#_x0000_t202" style="position:absolute;left:0;text-align:left;margin-left:-6.25pt;margin-top:12.1pt;width:38.55pt;height:36.95pt;z-index:251660800;visibility:visible;mso-wrap-style:square;mso-wrap-distance-left:9pt;mso-wrap-distance-top:0;mso-wrap-distance-right:9pt;mso-wrap-distance-bottom:0;mso-position-horizontal:absolute;mso-position-horizontal-relative:text;mso-position-vertical:absolute;mso-position-vertical-relative:text;v-text-anchor:top" o:gfxdata="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" filled="f" stroked="f">
+                      <v:textbox>
+                        <w:txbxContent>
+                          <w:p>
+                            <w:pPr>
+                              <w:rPr>
+                                <w:sz w:val="6"/>
+                                <w:szCs w:val="6"/>
+                                <w:lang w:val="en-US"/>
+                              </w:rPr>
+                            </w:pPr>
+                            <w:r>
+                              <w:rPr>
+                                <w:sz w:val="6"/>
+                                <w:szCs w:val="6"/>
+                              </w:rPr>
+                              <w:t>{%qr_code}</w:t>
+                            </w:r>
+                          </w:p>
+                        </w:txbxContent>
+                      </v:textbox>
+                    </v:shape>
+                  </w:pict>
+                </mc:Fallback>
+              </mc:AlternateContent>
+            </w:r>
           </w:p>
           <w:p>
             <w:pPr>
@@ -170,7 +285,7 @@
               <mc:AlternateContent>
                 <mc:Choice Requires="wps">
                   <w:drawing>
-                    <wp:anchor distT="0" distB="0" distL="114300" distR="114300" simplePos="0" relativeHeight="251659776" behindDoc="0" locked="0" layoutInCell="1" allowOverlap="1" wp14:anchorId="7C3741CB" wp14:editId="667BBCD3">
+                    <wp:anchor distT="0" distB="0" distL="114300" distR="114300" simplePos="0" relativeHeight="251659776" behindDoc="0" locked="0" layoutInCell="1" allowOverlap="1" wp14:anchorId="7C3741CB" wp14:editId="78DCB695">
                       <wp:simplePos x="0" y="0"/>
                       <wp:positionH relativeFrom="column">
                         <wp:posOffset>-55212</wp:posOffset>
@@ -238,11 +353,7 @@
                 </mc:Choice>
                 <mc:Fallback>
                   <w:pict>
-                    <v:shapetype w14:anchorId="7C3741CB" id="_x0000_t202" coordsize="21600,21600" o:spt="202" path="m,l,21600r21600,l21600,xe">
-                      <v:stroke joinstyle="miter"/>
-                      <v:path gradientshapeok="t" o:connecttype="rect"/>
-                    </v:shapetype>
-                    <v:shape id="Text Box 4" o:spid="_x0000_s1026" type="#_x0000_t202" style="position:absolute;left:0;text-align:left;margin-left:-4.35pt;margin-top:2.4pt;width:63.45pt;height:62.2pt;z-index:251659776;visibility:visible;mso-wrap-style:square;mso-wrap-distance-left:9pt;mso-wrap-distance-top:0;mso-wrap-distance-right:9pt;mso-wrap-distance-bottom:0;mso-position-horizontal:absolute;mso-position-horizontal-relative:text;mso-position-vertical:absolute;mso-position-vertical-relative:text;v-text-anchor:top" o:gfxdata="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" filled="f" strokeweight=".5pt">
+                    <v:shape w14:anchorId="7C3741CB" id="Text Box 4" o:spid="_x0000_s1027" type="#_x0000_t202" style="position:absolute;left:0;text-align:left;margin-left:-4.35pt;margin-top:2.4pt;width:63.45pt;height:62.2pt;z-index:251659776;visibility:visible;mso-wrap-style:square;mso-wrap-distance-left:9pt;mso-wrap-distance-top:0;mso-wrap-distance-right:9pt;mso-wrap-distance-bottom:0;mso-position-horizontal:absolute;mso-position-horizontal-relative:text;mso-position-vertical:absolute;mso-position-vertical-relative:text;v-text-anchor:top" o:gfxdata="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" filled="f" strokeweight=".5pt">
                       <v:textbox>
                         <w:txbxContent>
                           <w:p>
@@ -781,133 +892,39 @@
         <w:spacing w:after="0" w:line="240" w:lineRule="auto"/>
         <w:jc w:val="center"/>
         <w:rPr>
-          <w:lang w:val="en-US"/>
+          <w:lang w:val="en-ID"/>
         </w:rPr>
       </w:pPr>
       <w:r>
         <w:br w:type="page"/>
       </w:r>
+    </w:p>
+    <w:p>
+      <w:pPr>
+        <w:spacing w:after="0" w:line="240" w:lineRule="auto"/>
+        <w:jc w:val="center"/>
+        <w:rPr>
+          <w:lang w:val="en-ID"/>
+        </w:rPr>
+      </w:pPr>
       <w:r>
         <w:rPr>
-          <w:noProof/>
+          <w:lang w:val="en-ID"/>
         </w:rPr>
         <w:lastRenderedPageBreak/>
-        <mc:AlternateContent>
-          <mc:Choice Requires="wps">
-            <w:drawing>
-              <wp:anchor distT="0" distB="0" distL="114300" distR="114300" simplePos="0" relativeHeight="251660800" behindDoc="0" locked="0" layoutInCell="1" allowOverlap="1" wp14:anchorId="26796A42" wp14:editId="0A32E30B">
-                <wp:simplePos x="0" y="0"/>
-                <wp:positionH relativeFrom="column">
-                  <wp:posOffset>64168</wp:posOffset>
-                </wp:positionH>
-                <wp:positionV relativeFrom="paragraph">
-                  <wp:posOffset>1459832</wp:posOffset>
-                </wp:positionV>
-                <wp:extent cx="489285" cy="469231"/>
-                <wp:effectExtent l="0" t="0" r="0" b="7620"/>
-                <wp:wrapNone/>
-                <wp:docPr id="418808790" name="Text Box 5"/>
-                <wp:cNvGraphicFramePr/>
-                <a:graphic xmlns:a="http://schemas.openxmlformats.org/drawingml/2006/main">
-                  <a:graphicData uri="http://schemas.microsoft.com/office/word/2010/wordprocessingShape">
-                    <wps:wsp>
-                      <wps:cNvSpPr txBox="1"/>
-                      <wps:spPr>
-                        <a:xfrm>
-                          <a:off x="0" y="0"/>
-                          <a:ext cx="489285" cy="469231"/>
-                        </a:xfrm>
-                        <a:prstGeom prst="rect">
-                          <a:avLst/>
-                        </a:prstGeom>
-                        <a:noFill/>
-                        <a:ln>
-                          <a:noFill/>
-                        </a:ln>
-                      </wps:spPr>
-                      <wps:style>
-                        <a:lnRef idx="0">
-                          <a:scrgbClr r="0" g="0" b="0"/>
-                        </a:lnRef>
-                        <a:fillRef idx="0">
-                          <a:scrgbClr r="0" g="0" b="0"/>
-                        </a:fillRef>
-                        <a:effectRef idx="0">
-                          <a:scrgbClr r="0" g="0" b="0"/>
-                        </a:effectRef>
-                        <a:fontRef idx="minor">
-                          <a:schemeClr val="dk1"/>
-                        </a:fontRef>
-                      </wps:style>
-                      <wps:txbx>
-                        <w:txbxContent>
-                          <w:p>
-                            <w:pPr>
-                              <w:rPr>
-                                <w:sz w:val="6"/>
-                                <w:szCs w:val="6"/>
-                                <w:lang w:val="en-US"/>
-                              </w:rPr>
-                            </w:pPr>
-                            <w:r>
-                              <w:rPr>
-                                <w:sz w:val="6"/>
-                                <w:szCs w:val="6"/>
-                              </w:rPr>
-                              <w:t>{%qr_code}</w:t>
-                            </w:r>
-                          </w:p>
-                        </w:txbxContent>
-                      </wps:txbx>
-                      <wps:bodyPr rot="0" spcFirstLastPara="0" vertOverflow="overflow" horzOverflow="overflow" vert="horz" wrap="square" lIns="91440" tIns="45720" rIns="91440" bIns="45720" numCol="1" spcCol="0" rtlCol="0" fromWordArt="0" anchor="t" anchorCtr="0" forceAA="0" compatLnSpc="1">
-                        <a:prstTxWarp prst="textNoShape">
-                          <a:avLst/>
-                        </a:prstTxWarp>
-                        <a:noAutofit/>
-                      </wps:bodyPr>
-                    </wps:wsp>
-                  </a:graphicData>
-                </a:graphic>
-              </wp:anchor>
-            </w:drawing>
-          </mc:Choice>
-          <mc:Fallback>
-            <w:pict>
-              <v:shape w14:anchorId="26796A42" id="Text Box 5" o:spid="_x0000_s1027" type="#_x0000_t202" style="position:absolute;left:0;text-align:left;margin-left:5.05pt;margin-top:114.95pt;width:38.55pt;height:36.95pt;z-index:251660800;visibility:visible;mso-wrap-style:square;mso-wrap-distance-left:9pt;mso-wrap-distance-top:0;mso-wrap-distance-right:9pt;mso-wrap-distance-bottom:0;mso-position-horizontal:absolute;mso-position-horizontal-relative:text;mso-position-vertical:absolute;mso-position-vertical-relative:text;v-text-anchor:top" o:gfxdata="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" filled="f" stroked="f">
-                <v:textbox>
-                  <w:txbxContent>
-                    <w:p>
-                      <w:pPr>
-                        <w:rPr>
-                          <w:sz w:val="6"/>
-                          <w:szCs w:val="6"/>
-                          <w:lang w:val="en-US"/>
-                        </w:rPr>
-                      </w:pPr>
-                      <w:r>
-                        <w:rPr>
-                          <w:sz w:val="6"/>
-                          <w:szCs w:val="6"/>
-                        </w:rPr>
-                        <w:t>{%qr_code}</w:t>
-                      </w:r>
-                    </w:p>
-                  </w:txbxContent>
-                </v:textbox>
-              </v:shape>
-            </w:pict>
-          </mc:Fallback>
-        </mc:AlternateContent>
-      </w:r>
-      <w:r>
-        <w:rPr>
-          <w:noProof/>
-        </w:rPr>
         <w:drawing>
-          <wp:inline distT="0" distB="0" distL="0" distR="0" wp14:anchorId="6B19FFCF" wp14:editId="2BE76043">
-            <wp:extent cx="1946910" cy="3096666"/>
-            <wp:effectExtent l="0" t="0" r="0" b="8890"/>
-            <wp:docPr id="2" name="Picture 1"/>
+          <wp:anchor distT="0" distB="0" distL="114300" distR="114300" simplePos="0" relativeHeight="251661824" behindDoc="1" locked="0" layoutInCell="1" allowOverlap="1" wp14:anchorId="420CFA3B" wp14:editId="11390D04">
+            <wp:simplePos x="0" y="0"/>
+            <wp:positionH relativeFrom="margin">
+              <wp:posOffset>9099</wp:posOffset>
+            </wp:positionH>
+            <wp:positionV relativeFrom="paragraph">
+              <wp:posOffset>4549</wp:posOffset>
+            </wp:positionV>
+            <wp:extent cx="1954738" cy="3082109"/>
+            <wp:effectExtent l="0" t="0" r="7620" b="4445"/>
+            <wp:wrapNone/>
+            <wp:docPr id="1074156846" name="Picture 6"/>
             <wp:cNvGraphicFramePr>
               <a:graphicFrameLocks xmlns:a="http://schemas.openxmlformats.org/drawingml/2006/main" noChangeAspect="1"/>
             </wp:cNvGraphicFramePr>
@@ -915,13 +932,13 @@
               <a:graphicData uri="http://schemas.openxmlformats.org/drawingml/2006/picture">
                 <pic:pic xmlns:pic="http://schemas.openxmlformats.org/drawingml/2006/picture">
                   <pic:nvPicPr>
-                    <pic:cNvPr id="0" name="Picture 2"/>
+                    <pic:cNvPr id="0" name="Picture 6"/>
                     <pic:cNvPicPr>
                       <a:picLocks noChangeAspect="1" noChangeArrowheads="1"/>
                     </pic:cNvPicPr>
                   </pic:nvPicPr>
                   <pic:blipFill>
-                    <a:blip r:embed="rId7" cstate="print">
+                    <a:blip r:embed="rId7">
                       <a:extLst>
                         <a:ext uri="{28A0092B-C50C-407E-A947-70E740481C1C}">
                           <a14:useLocalDpi xmlns:a14="http://schemas.microsoft.com/office/drawing/2010/main" val="0"/>
@@ -936,7 +953,7 @@
                   <pic:spPr bwMode="auto">
                     <a:xfrm>
                       <a:off x="0" y="0"/>
-                      <a:ext cx="1948913" cy="3099851"/>
+                      <a:ext cx="1964945" cy="3098202"/>
                     </a:xfrm>
                     <a:prstGeom prst="rect">
                       <a:avLst/>
@@ -949,14 +966,14 @@
                 </pic:pic>
               </a:graphicData>
             </a:graphic>
-          </wp:inline>
+            <wp14:sizeRelH relativeFrom="margin">
+              <wp14:pctWidth>0</wp14:pctWidth>
+            </wp14:sizeRelH>
+            <wp14:sizeRelV relativeFrom="margin">
+              <wp14:pctHeight>0</wp14:pctHeight>
+            </wp14:sizeRelV>
+          </wp:anchor>
         </w:drawing>
-      </w:r>
-      <w:r>
-        <w:rPr>
-          <w:lang w:val="en-US"/>
-        </w:rPr>
-        <w:t xml:space="preserve"> </w:t>
       </w:r>
       <w:r>
         <w:rPr>
@@ -968,7 +985,7 @@
         <mc:AlternateContent>
           <mc:Choice Requires="wps">
             <w:drawing>
-              <wp:anchor distT="0" distB="0" distL="114300" distR="114300" simplePos="0" relativeHeight="251657728" behindDoc="0" locked="0" layoutInCell="1" allowOverlap="1" wp14:anchorId="5F7788C8" wp14:editId="7D818364">
+              <wp:anchor distT="0" distB="0" distL="114300" distR="114300" simplePos="0" relativeHeight="251657728" behindDoc="0" locked="0" layoutInCell="1" allowOverlap="1" wp14:anchorId="5F7788C8" wp14:editId="2504D426">
                 <wp:simplePos x="0" y="0"/>
                 <wp:positionH relativeFrom="column">
                   <wp:posOffset>2183130</wp:posOffset>
@@ -1029,7 +1046,7 @@
           </mc:Choice>
           <mc:Fallback>
             <w:pict>
-              <v:rect w14:anchorId="248AC1D1" id="Rectangle 23" o:spid="_x0000_s1026" style="position:absolute;margin-left:171.9pt;margin-top:180.5pt;width:7.85pt;height:50.95pt;z-index:251657728;visibility:visible;mso-wrap-style:square;mso-width-percent:0;mso-height-percent:0;mso-wrap-distance-left:9pt;mso-wrap-distance-top:0;mso-wrap-distance-right:9pt;mso-wrap-distance-bottom:0;mso-position-horizontal:absolute;mso-position-horizontal-relative:text;mso-position-vertical:absolute;mso-position-vertical-relative:text;mso-width-percent:0;mso-height-percent:0;mso-width-relative:page;mso-height-relative:page;v-text-anchor:top" o:gfxdata="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" fillcolor="#bfbfbf"/>
+              <v:rect w14:anchorId="5568DBED" id="Rectangle 23" o:spid="_x0000_s1026" style="position:absolute;margin-left:171.9pt;margin-top:180.5pt;width:7.85pt;height:50.95pt;z-index:251657728;visibility:visible;mso-wrap-style:square;mso-width-percent:0;mso-height-percent:0;mso-wrap-distance-left:9pt;mso-wrap-distance-top:0;mso-wrap-distance-right:9pt;mso-wrap-distance-bottom:0;mso-position-horizontal:absolute;mso-position-horizontal-relative:text;mso-position-vertical:absolute;mso-position-vertical-relative:text;mso-width-percent:0;mso-height-percent:0;mso-width-relative:page;mso-height-relative:page;v-text-anchor:top" o:gfxdata="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" fillcolor="#bfbfbf"/>
             </w:pict>
           </mc:Fallback>
         </mc:AlternateContent>
@@ -1110,6 +1127,128 @@
           </mc:Fallback>
         </mc:AlternateContent>
       </w:r>
+    </w:p>
+    <w:p>
+      <w:pPr>
+        <w:rPr>
+          <w:lang w:val="en-ID"/>
+        </w:rPr>
+      </w:pPr>
+    </w:p>
+    <w:p>
+      <w:pPr>
+        <w:rPr>
+          <w:lang w:val="en-ID"/>
+        </w:rPr>
+      </w:pPr>
+    </w:p>
+    <w:p>
+      <w:pPr>
+        <w:rPr>
+          <w:lang w:val="en-ID"/>
+        </w:rPr>
+      </w:pPr>
+    </w:p>
+    <w:p>
+      <w:pPr>
+        <w:rPr>
+          <w:lang w:val="en-ID"/>
+        </w:rPr>
+      </w:pPr>
+    </w:p>
+    <w:p>
+      <w:pPr>
+        <w:rPr>
+          <w:lang w:val="en-ID"/>
+        </w:rPr>
+      </w:pPr>
+    </w:p>
+    <w:tbl>
+      <w:tblPr>
+        <w:tblStyle w:val="TableGrid"/>
+        <w:tblW w:w="0" w:type="auto"/>
+        <w:tblBorders>
+          <w:top w:val="none" w:sz="0" w:space="0" w:color="auto"/>
+          <w:left w:val="none" w:sz="0" w:space="0" w:color="auto"/>
+          <w:bottom w:val="none" w:sz="0" w:space="0" w:color="auto"/>
+          <w:right w:val="none" w:sz="0" w:space="0" w:color="auto"/>
+          <w:insideH w:val="none" w:sz="0" w:space="0" w:color="auto"/>
+          <w:insideV w:val="none" w:sz="0" w:space="0" w:color="auto"/>
+        </w:tblBorders>
+        <w:tblLook w:val="04A0" w:firstRow="1" w:lastRow="0" w:firstColumn="1" w:lastColumn="0" w:noHBand="0" w:noVBand="1"/>
+      </w:tblPr>
+      <w:tblGrid>
+        <w:gridCol w:w="3080"/>
+      </w:tblGrid>
+      <w:tr>
+        <w:trPr>
+          <w:trHeight w:val="207"/>
+        </w:trPr>
+        <w:tc>
+          <w:tcPr>
+            <w:tcW w:w="3080" w:type="dxa"/>
+          </w:tcPr>
+          <w:p>
+            <w:pPr>
+              <w:rPr>
+                <w:sz w:val="10"/>
+                <w:szCs w:val="10"/>
+                <w:lang w:val="en-ID"/>
+              </w:rPr>
+            </w:pPr>
+          </w:p>
+          <w:p>
+            <w:pPr>
+              <w:rPr>
+                <w:sz w:val="10"/>
+                <w:szCs w:val="10"/>
+                <w:lang w:val="en-ID"/>
+              </w:rPr>
+            </w:pPr>
+            <w:r>
+              <w:rPr>
+                <w:sz w:val="10"/>
+                <w:szCs w:val="10"/>
+                <w:lang w:val="en-ID"/>
+              </w:rPr>
+              <w:t xml:space="preserve">Padang, </w:t>
+            </w:r>
+            <w:r>
+              <w:rPr>
+                <w:sz w:val="10"/>
+                <w:szCs w:val="10"/>
+                <w:lang w:val="en-ID"/>
+              </w:rPr>
+              <w:t>{</w:t>
+            </w:r>
+            <w:proofErr w:type="spellStart"/>
+            <w:r>
+              <w:rPr>
+                <w:sz w:val="10"/>
+                <w:szCs w:val="10"/>
+                <w:lang w:val="en-ID"/>
+              </w:rPr>
+              <w:t>tanggal_cetak_lengkap</w:t>
+            </w:r>
+            <w:proofErr w:type="spellEnd"/>
+            <w:r>
+              <w:rPr>
+                <w:sz w:val="10"/>
+                <w:szCs w:val="10"/>
+                <w:lang w:val="en-ID"/>
+              </w:rPr>
+              <w:t>}</w:t>
+            </w:r>
+          </w:p>
+        </w:tc>
+      </w:tr>
+    </w:tbl>
+    <w:p>
+      <w:pPr>
+        <w:rPr>
+          <w:lang w:val="en-ID"/>
+        </w:rPr>
+      </w:pPr>
     </w:p>
     <w:sectPr>
       <w:pgSz w:w="3090" w:h="4876" w:code="153"/>
@@ -1623,7 +1762,6 @@
   <w:style w:type="character" w:default="1" w:styleId="DefaultParagraphFont">
     <w:name w:val="Default Paragraph Font"/>
     <w:uiPriority w:val="1"/>
-    <w:semiHidden/>
     <w:unhideWhenUsed/>
   </w:style>
   <w:style w:type="table" w:default="1" w:styleId="TableNormal">
@@ -1700,6 +1838,19 @@
     <w:rPr>
       <w:color w:val="0000FF"/>
       <w:u w:val="single"/>
+    </w:rPr>
+  </w:style>
+  <w:style w:type="paragraph" w:styleId="NormalWeb">
+    <w:name w:val="Normal (Web)"/>
+    <w:basedOn w:val="Normal"/>
+    <w:uiPriority w:val="99"/>
+    <w:semiHidden/>
+    <w:unhideWhenUsed/>
+    <w:rsid w:val="00994026"/>
+    <w:rPr>
+      <w:rFonts w:ascii="Times New Roman" w:hAnsi="Times New Roman"/>
+      <w:sz w:val="24"/>
+      <w:szCs w:val="24"/>
     </w:rPr>
   </w:style>
 </w:styles>

</xml_diff>

<commit_message>
fix: perbaikan error 500 proses kartu akses (type_unit TEXT, upsert kartu, migrasi kartu)
</commit_message>
<xml_diff>
--- a/backend/uploads/templates/merah.docx
+++ b/backend/uploads/templates/merah.docx
@@ -17,7 +17,7 @@
           <w:noProof/>
         </w:rPr>
         <w:drawing>
-          <wp:anchor distT="0" distB="0" distL="114300" distR="114300" simplePos="0" relativeHeight="251658752" behindDoc="1" locked="0" layoutInCell="1" allowOverlap="1" wp14:anchorId="6054091E" wp14:editId="06348554">
+          <wp:anchor distT="0" distB="0" distL="114300" distR="114300" simplePos="0" relativeHeight="251658752" behindDoc="1" locked="0" layoutInCell="1" allowOverlap="1" wp14:anchorId="6054091E" wp14:editId="407D548F">
             <wp:simplePos x="0" y="0"/>
             <wp:positionH relativeFrom="margin">
               <wp:posOffset>-9098</wp:posOffset>
@@ -909,20 +909,21 @@
       </w:pPr>
       <w:r>
         <w:rPr>
+          <w:noProof/>
           <w:lang w:val="en-ID"/>
         </w:rPr>
         <w:lastRenderedPageBreak/>
         <w:drawing>
-          <wp:anchor distT="0" distB="0" distL="114300" distR="114300" simplePos="0" relativeHeight="251661824" behindDoc="1" locked="0" layoutInCell="1" allowOverlap="1" wp14:anchorId="420CFA3B" wp14:editId="11390D04">
+          <wp:anchor distT="0" distB="0" distL="114300" distR="114300" simplePos="0" relativeHeight="251661824" behindDoc="1" locked="0" layoutInCell="1" allowOverlap="1" wp14:anchorId="420CFA3B" wp14:editId="5A2B0C22">
             <wp:simplePos x="0" y="0"/>
             <wp:positionH relativeFrom="margin">
-              <wp:posOffset>9099</wp:posOffset>
+              <wp:align>right</wp:align>
             </wp:positionH>
             <wp:positionV relativeFrom="paragraph">
-              <wp:posOffset>4549</wp:posOffset>
+              <wp:posOffset>4055</wp:posOffset>
             </wp:positionV>
-            <wp:extent cx="1954738" cy="3082109"/>
-            <wp:effectExtent l="0" t="0" r="7620" b="4445"/>
+            <wp:extent cx="1962561" cy="3081655"/>
+            <wp:effectExtent l="0" t="0" r="0" b="4445"/>
             <wp:wrapNone/>
             <wp:docPr id="1074156846" name="Picture 6"/>
             <wp:cNvGraphicFramePr>
@@ -953,7 +954,7 @@
                   <pic:spPr bwMode="auto">
                     <a:xfrm>
                       <a:off x="0" y="0"/>
-                      <a:ext cx="1964945" cy="3098202"/>
+                      <a:ext cx="1962561" cy="3081655"/>
                     </a:xfrm>
                     <a:prstGeom prst="rect">
                       <a:avLst/>
@@ -1211,15 +1212,7 @@
                 <w:szCs w:val="10"/>
                 <w:lang w:val="en-ID"/>
               </w:rPr>
-              <w:t xml:space="preserve">Padang, </w:t>
-            </w:r>
-            <w:r>
-              <w:rPr>
-                <w:sz w:val="10"/>
-                <w:szCs w:val="10"/>
-                <w:lang w:val="en-ID"/>
-              </w:rPr>
-              <w:t>{</w:t>
+              <w:t>Padang, {</w:t>
             </w:r>
             <w:proofErr w:type="spellStart"/>
             <w:r>
@@ -1762,6 +1755,7 @@
   <w:style w:type="character" w:default="1" w:styleId="DefaultParagraphFont">
     <w:name w:val="Default Paragraph Font"/>
     <w:uiPriority w:val="1"/>
+    <w:semiHidden/>
     <w:unhideWhenUsed/>
   </w:style>
   <w:style w:type="table" w:default="1" w:styleId="TableNormal">

</xml_diff>